<commit_message>
HTML en CSS template ai
</commit_message>
<xml_diff>
--- a/Restaurant Project.docx
+++ b/Restaurant Project.docx
@@ -17,7 +17,7 @@
           <w:noProof/>
         </w:rPr>
         <w:drawing>
-          <wp:anchor distT="0" distB="0" distL="114300" distR="114300" simplePos="0" relativeHeight="251658240" behindDoc="1" locked="0" layoutInCell="1" allowOverlap="1" wp14:anchorId="6269EEC7" wp14:editId="0196BC00">
+          <wp:anchor distT="0" distB="0" distL="114300" distR="114300" simplePos="0" relativeHeight="251658240" behindDoc="1" locked="0" layoutInCell="1" allowOverlap="1" wp14:anchorId="6269EEC7" wp14:editId="2523006E">
             <wp:simplePos x="0" y="0"/>
             <wp:positionH relativeFrom="column">
               <wp:posOffset>68580</wp:posOffset>
@@ -307,6 +307,7 @@
           </wp:anchor>
         </w:drawing>
       </w:r>
+      <w:proofErr w:type="spellStart"/>
       <w:r>
         <w:rPr>
           <w:b/>
@@ -316,6 +317,7 @@
         </w:rPr>
         <w:t>Inspiration</w:t>
       </w:r>
+      <w:proofErr w:type="spellEnd"/>
     </w:p>
     <w:p>
       <w:pPr>
@@ -425,6 +427,7 @@
       </w:pPr>
       <w:r>
         <w:rPr>
+          <w:noProof/>
           <w:sz w:val="56"/>
           <w:szCs w:val="56"/>
         </w:rPr>
@@ -809,6 +812,7 @@
                 <w:szCs w:val="44"/>
               </w:rPr>
             </w:pPr>
+            <w:proofErr w:type="spellStart"/>
             <w:r>
               <w:rPr>
                 <w:b/>
@@ -818,6 +822,7 @@
               </w:rPr>
               <w:t>Primary</w:t>
             </w:r>
+            <w:proofErr w:type="spellEnd"/>
           </w:p>
         </w:tc>
         <w:tc>
@@ -859,6 +864,7 @@
                 <w:szCs w:val="56"/>
               </w:rPr>
             </w:pPr>
+            <w:proofErr w:type="spellStart"/>
             <w:r>
               <w:rPr>
                 <w:b/>
@@ -868,6 +874,7 @@
               </w:rPr>
               <w:t>Secondary</w:t>
             </w:r>
+            <w:proofErr w:type="spellEnd"/>
           </w:p>
         </w:tc>
         <w:tc>
@@ -970,8 +977,19 @@
                 <w:sz w:val="44"/>
                 <w:szCs w:val="44"/>
               </w:rPr>
-              <w:t>Border/Muted</w:t>
+              <w:t>Border/</w:t>
             </w:r>
+            <w:proofErr w:type="spellStart"/>
+            <w:r>
+              <w:rPr>
+                <w:b/>
+                <w:bCs/>
+                <w:sz w:val="44"/>
+                <w:szCs w:val="44"/>
+              </w:rPr>
+              <w:t>Muted</w:t>
+            </w:r>
+            <w:proofErr w:type="spellEnd"/>
           </w:p>
         </w:tc>
         <w:tc>
@@ -1011,6 +1029,7 @@
                 <w:szCs w:val="44"/>
               </w:rPr>
             </w:pPr>
+            <w:proofErr w:type="spellStart"/>
             <w:r>
               <w:rPr>
                 <w:b/>
@@ -1018,8 +1037,29 @@
                 <w:sz w:val="44"/>
                 <w:szCs w:val="44"/>
               </w:rPr>
-              <w:t>Primary Text</w:t>
+              <w:t>Primary</w:t>
             </w:r>
+            <w:proofErr w:type="spellEnd"/>
+            <w:r>
+              <w:rPr>
+                <w:b/>
+                <w:bCs/>
+                <w:sz w:val="44"/>
+                <w:szCs w:val="44"/>
+              </w:rPr>
+              <w:t xml:space="preserve"> </w:t>
+            </w:r>
+            <w:proofErr w:type="spellStart"/>
+            <w:r>
+              <w:rPr>
+                <w:b/>
+                <w:bCs/>
+                <w:sz w:val="44"/>
+                <w:szCs w:val="44"/>
+              </w:rPr>
+              <w:t>Text</w:t>
+            </w:r>
+            <w:proofErr w:type="spellEnd"/>
           </w:p>
         </w:tc>
         <w:tc>
@@ -1059,6 +1099,7 @@
                 <w:szCs w:val="44"/>
               </w:rPr>
             </w:pPr>
+            <w:proofErr w:type="spellStart"/>
             <w:r>
               <w:rPr>
                 <w:b/>
@@ -1066,8 +1107,29 @@
                 <w:sz w:val="44"/>
                 <w:szCs w:val="44"/>
               </w:rPr>
-              <w:t>Secondary Text</w:t>
+              <w:t>Secondary</w:t>
             </w:r>
+            <w:proofErr w:type="spellEnd"/>
+            <w:r>
+              <w:rPr>
+                <w:b/>
+                <w:bCs/>
+                <w:sz w:val="44"/>
+                <w:szCs w:val="44"/>
+              </w:rPr>
+              <w:t xml:space="preserve"> </w:t>
+            </w:r>
+            <w:proofErr w:type="spellStart"/>
+            <w:r>
+              <w:rPr>
+                <w:b/>
+                <w:bCs/>
+                <w:sz w:val="44"/>
+                <w:szCs w:val="44"/>
+              </w:rPr>
+              <w:t>Text</w:t>
+            </w:r>
+            <w:proofErr w:type="spellEnd"/>
           </w:p>
         </w:tc>
         <w:tc>
@@ -1637,6 +1699,7 @@
                 <w:szCs w:val="44"/>
               </w:rPr>
             </w:pPr>
+            <w:proofErr w:type="spellStart"/>
             <w:r>
               <w:rPr>
                 <w:b/>
@@ -1644,8 +1707,29 @@
                 <w:sz w:val="44"/>
                 <w:szCs w:val="44"/>
               </w:rPr>
-              <w:t>Bebas Neue</w:t>
+              <w:t>Bebas</w:t>
             </w:r>
+            <w:proofErr w:type="spellEnd"/>
+            <w:r>
+              <w:rPr>
+                <w:b/>
+                <w:bCs/>
+                <w:sz w:val="44"/>
+                <w:szCs w:val="44"/>
+              </w:rPr>
+              <w:t xml:space="preserve"> </w:t>
+            </w:r>
+            <w:proofErr w:type="spellStart"/>
+            <w:r>
+              <w:rPr>
+                <w:b/>
+                <w:bCs/>
+                <w:sz w:val="44"/>
+                <w:szCs w:val="44"/>
+              </w:rPr>
+              <w:t>Neue</w:t>
+            </w:r>
+            <w:proofErr w:type="spellEnd"/>
           </w:p>
         </w:tc>
         <w:tc>
@@ -1662,6 +1746,7 @@
                 <w:szCs w:val="44"/>
               </w:rPr>
             </w:pPr>
+            <w:proofErr w:type="spellStart"/>
             <w:r>
               <w:rPr>
                 <w:b/>
@@ -1669,8 +1754,29 @@
                 <w:sz w:val="44"/>
                 <w:szCs w:val="44"/>
               </w:rPr>
-              <w:t>Cormorant Garamond</w:t>
+              <w:t>Cormorant</w:t>
             </w:r>
+            <w:proofErr w:type="spellEnd"/>
+            <w:r>
+              <w:rPr>
+                <w:b/>
+                <w:bCs/>
+                <w:sz w:val="44"/>
+                <w:szCs w:val="44"/>
+              </w:rPr>
+              <w:t xml:space="preserve"> </w:t>
+            </w:r>
+            <w:proofErr w:type="spellStart"/>
+            <w:r>
+              <w:rPr>
+                <w:b/>
+                <w:bCs/>
+                <w:sz w:val="44"/>
+                <w:szCs w:val="44"/>
+              </w:rPr>
+              <w:t>Garamond</w:t>
+            </w:r>
+            <w:proofErr w:type="spellEnd"/>
           </w:p>
         </w:tc>
         <w:tc>
@@ -1740,6 +1846,7 @@
           <w:szCs w:val="56"/>
         </w:rPr>
       </w:pPr>
+      <w:proofErr w:type="spellStart"/>
       <w:r>
         <w:rPr>
           <w:b/>
@@ -1749,6 +1856,916 @@
         </w:rPr>
         <w:lastRenderedPageBreak/>
         <w:t>Wireframes</w:t>
+      </w:r>
+      <w:proofErr w:type="spellEnd"/>
+    </w:p>
+    <w:p>
+      <w:pPr>
+        <w:jc w:val="center"/>
+        <w:rPr>
+          <w:b/>
+          <w:bCs/>
+          <w:sz w:val="56"/>
+          <w:szCs w:val="56"/>
+        </w:rPr>
+      </w:pPr>
+      <w:r>
+        <w:rPr>
+          <w:b/>
+          <w:bCs/>
+          <w:noProof/>
+          <w:sz w:val="56"/>
+          <w:szCs w:val="56"/>
+        </w:rPr>
+        <w:drawing>
+          <wp:inline distT="0" distB="0" distL="0" distR="0" wp14:anchorId="0E2E417F" wp14:editId="35599285">
+            <wp:extent cx="5731510" cy="3229610"/>
+            <wp:effectExtent l="0" t="0" r="2540" b="8890"/>
+            <wp:docPr id="293628080" name="Afbeelding 1"/>
+            <wp:cNvGraphicFramePr>
+              <a:graphicFrameLocks xmlns:a="http://schemas.openxmlformats.org/drawingml/2006/main" noChangeAspect="1"/>
+            </wp:cNvGraphicFramePr>
+            <a:graphic xmlns:a="http://schemas.openxmlformats.org/drawingml/2006/main">
+              <a:graphicData uri="http://schemas.openxmlformats.org/drawingml/2006/picture">
+                <pic:pic xmlns:pic="http://schemas.openxmlformats.org/drawingml/2006/picture">
+                  <pic:nvPicPr>
+                    <pic:cNvPr id="293628080" name=""/>
+                    <pic:cNvPicPr/>
+                  </pic:nvPicPr>
+                  <pic:blipFill>
+                    <a:blip r:embed="rId12"/>
+                    <a:stretch>
+                      <a:fillRect/>
+                    </a:stretch>
+                  </pic:blipFill>
+                  <pic:spPr>
+                    <a:xfrm>
+                      <a:off x="0" y="0"/>
+                      <a:ext cx="5731510" cy="3229610"/>
+                    </a:xfrm>
+                    <a:prstGeom prst="rect">
+                      <a:avLst/>
+                    </a:prstGeom>
+                  </pic:spPr>
+                </pic:pic>
+              </a:graphicData>
+            </a:graphic>
+          </wp:inline>
+        </w:drawing>
+      </w:r>
+    </w:p>
+    <w:p>
+      <w:pPr>
+        <w:jc w:val="center"/>
+        <w:rPr>
+          <w:b/>
+          <w:bCs/>
+          <w:sz w:val="56"/>
+          <w:szCs w:val="56"/>
+        </w:rPr>
+      </w:pPr>
+      <w:r>
+        <w:rPr>
+          <w:b/>
+          <w:bCs/>
+          <w:noProof/>
+          <w:sz w:val="56"/>
+          <w:szCs w:val="56"/>
+        </w:rPr>
+        <w:drawing>
+          <wp:inline distT="0" distB="0" distL="0" distR="0" wp14:anchorId="61AFCF4C" wp14:editId="60B05E1E">
+            <wp:extent cx="5731510" cy="3230245"/>
+            <wp:effectExtent l="0" t="0" r="2540" b="8255"/>
+            <wp:docPr id="613242083" name="Afbeelding 1" descr="Afbeelding met tekst, schermopname, plein, Rechthoek&#10;&#10;Door AI gegenereerde inhoud is mogelijk onjuist."/>
+            <wp:cNvGraphicFramePr>
+              <a:graphicFrameLocks xmlns:a="http://schemas.openxmlformats.org/drawingml/2006/main" noChangeAspect="1"/>
+            </wp:cNvGraphicFramePr>
+            <a:graphic xmlns:a="http://schemas.openxmlformats.org/drawingml/2006/main">
+              <a:graphicData uri="http://schemas.openxmlformats.org/drawingml/2006/picture">
+                <pic:pic xmlns:pic="http://schemas.openxmlformats.org/drawingml/2006/picture">
+                  <pic:nvPicPr>
+                    <pic:cNvPr id="613242083" name="Afbeelding 1" descr="Afbeelding met tekst, schermopname, plein, Rechthoek&#10;&#10;Door AI gegenereerde inhoud is mogelijk onjuist."/>
+                    <pic:cNvPicPr/>
+                  </pic:nvPicPr>
+                  <pic:blipFill>
+                    <a:blip r:embed="rId13"/>
+                    <a:stretch>
+                      <a:fillRect/>
+                    </a:stretch>
+                  </pic:blipFill>
+                  <pic:spPr>
+                    <a:xfrm>
+                      <a:off x="0" y="0"/>
+                      <a:ext cx="5731510" cy="3230245"/>
+                    </a:xfrm>
+                    <a:prstGeom prst="rect">
+                      <a:avLst/>
+                    </a:prstGeom>
+                  </pic:spPr>
+                </pic:pic>
+              </a:graphicData>
+            </a:graphic>
+          </wp:inline>
+        </w:drawing>
+      </w:r>
+    </w:p>
+    <w:p>
+      <w:pPr>
+        <w:rPr>
+          <w:b/>
+          <w:bCs/>
+          <w:sz w:val="56"/>
+          <w:szCs w:val="56"/>
+        </w:rPr>
+      </w:pPr>
+      <w:r>
+        <w:rPr>
+          <w:b/>
+          <w:bCs/>
+          <w:sz w:val="56"/>
+          <w:szCs w:val="56"/>
+        </w:rPr>
+        <w:br w:type="page"/>
+      </w:r>
+    </w:p>
+    <w:p>
+      <w:pPr>
+        <w:jc w:val="center"/>
+        <w:rPr>
+          <w:b/>
+          <w:bCs/>
+          <w:sz w:val="56"/>
+          <w:szCs w:val="56"/>
+        </w:rPr>
+      </w:pPr>
+      <w:r>
+        <w:rPr>
+          <w:b/>
+          <w:bCs/>
+          <w:sz w:val="56"/>
+          <w:szCs w:val="56"/>
+        </w:rPr>
+        <w:lastRenderedPageBreak/>
+        <w:t xml:space="preserve">Ai </w:t>
+      </w:r>
+    </w:p>
+    <w:p>
+      <w:pPr>
+        <w:rPr>
+          <w:b/>
+          <w:bCs/>
+          <w:lang w:val="en-GB"/>
+        </w:rPr>
+      </w:pPr>
+      <w:r>
+        <w:rPr>
+          <w:b/>
+          <w:bCs/>
+          <w:lang w:val="en-GB"/>
+        </w:rPr>
+        <w:t xml:space="preserve">1. </w:t>
+      </w:r>
+      <w:r>
+        <w:rPr>
+          <w:lang w:val="en-GB"/>
+        </w:rPr>
+        <w:t xml:space="preserve">I want to make a website for </w:t>
+      </w:r>
+      <w:proofErr w:type="gramStart"/>
+      <w:r>
+        <w:rPr>
+          <w:lang w:val="en-GB"/>
+        </w:rPr>
+        <w:t>my the</w:t>
+      </w:r>
+      <w:proofErr w:type="gramEnd"/>
+      <w:r>
+        <w:rPr>
+          <w:lang w:val="en-GB"/>
+        </w:rPr>
+        <w:t xml:space="preserve"> company now the website should only contain html and </w:t>
+      </w:r>
+      <w:proofErr w:type="spellStart"/>
+      <w:r>
+        <w:rPr>
+          <w:lang w:val="en-GB"/>
+        </w:rPr>
+        <w:t>css</w:t>
+      </w:r>
+      <w:proofErr w:type="spellEnd"/>
+      <w:r>
+        <w:rPr>
+          <w:lang w:val="en-GB"/>
+        </w:rPr>
+        <w:t xml:space="preserve"> this is my wireframe </w:t>
+      </w:r>
+      <w:proofErr w:type="spellStart"/>
+      <w:r>
+        <w:rPr>
+          <w:lang w:val="en-GB"/>
+        </w:rPr>
+        <w:t>i</w:t>
+      </w:r>
+      <w:proofErr w:type="spellEnd"/>
+      <w:r>
+        <w:rPr>
+          <w:lang w:val="en-GB"/>
+        </w:rPr>
+        <w:t xml:space="preserve"> made. make the website based on this wireframe the left picture would be the home page use place holders for everything for now so </w:t>
+      </w:r>
+      <w:proofErr w:type="spellStart"/>
+      <w:r>
+        <w:rPr>
+          <w:lang w:val="en-GB"/>
+        </w:rPr>
+        <w:t>i</w:t>
+      </w:r>
+      <w:proofErr w:type="spellEnd"/>
+      <w:r>
+        <w:rPr>
+          <w:lang w:val="en-GB"/>
+        </w:rPr>
+        <w:t xml:space="preserve"> can change it easily</w:t>
+      </w:r>
+      <w:r>
+        <w:rPr>
+          <w:lang w:val="en-GB"/>
+        </w:rPr>
+        <w:t xml:space="preserve">. </w:t>
+      </w:r>
+    </w:p>
+    <w:p>
+      <w:pPr>
+        <w:rPr>
+          <w:lang w:val="en-GB"/>
+        </w:rPr>
+      </w:pPr>
+      <w:r>
+        <w:rPr>
+          <w:b/>
+          <w:bCs/>
+          <w:lang w:val="en-GB"/>
+        </w:rPr>
+        <w:t>2.</w:t>
+      </w:r>
+      <w:r>
+        <w:rPr>
+          <w:b/>
+          <w:bCs/>
+          <w:lang w:val="en-GB"/>
+        </w:rPr>
+        <w:t xml:space="preserve"> </w:t>
+      </w:r>
+      <w:r>
+        <w:rPr>
+          <w:lang w:val="en-GB"/>
+        </w:rPr>
+        <w:t xml:space="preserve">give me the </w:t>
+      </w:r>
+      <w:proofErr w:type="spellStart"/>
+      <w:r>
+        <w:rPr>
+          <w:lang w:val="en-GB"/>
+        </w:rPr>
+        <w:t>css</w:t>
+      </w:r>
+      <w:proofErr w:type="spellEnd"/>
+      <w:r>
+        <w:rPr>
+          <w:lang w:val="en-GB"/>
+        </w:rPr>
+        <w:t xml:space="preserve"> and html files </w:t>
+      </w:r>
+      <w:r>
+        <w:rPr>
+          <w:lang w:val="en-GB"/>
+        </w:rPr>
+        <w:t>separate.</w:t>
+      </w:r>
+    </w:p>
+    <w:p>
+      <w:pPr>
+        <w:rPr>
+          <w:b/>
+          <w:bCs/>
+          <w:lang w:val="en-GB"/>
+        </w:rPr>
+      </w:pPr>
+      <w:r>
+        <w:rPr>
+          <w:b/>
+          <w:bCs/>
+          <w:lang w:val="en-GB"/>
+        </w:rPr>
+        <w:t>3</w:t>
+      </w:r>
+      <w:r>
+        <w:rPr>
+          <w:lang w:val="en-GB"/>
+        </w:rPr>
+        <w:t xml:space="preserve">. </w:t>
+      </w:r>
+      <w:r>
+        <w:rPr>
+          <w:lang w:val="en-GB"/>
+        </w:rPr>
+        <w:t>I</w:t>
+      </w:r>
+      <w:r>
+        <w:rPr>
+          <w:lang w:val="en-GB"/>
+        </w:rPr>
+        <w:t xml:space="preserve"> asked for only html and </w:t>
+      </w:r>
+      <w:proofErr w:type="spellStart"/>
+      <w:proofErr w:type="gramStart"/>
+      <w:r>
+        <w:rPr>
+          <w:lang w:val="en-GB"/>
+        </w:rPr>
+        <w:t>css</w:t>
+      </w:r>
+      <w:proofErr w:type="spellEnd"/>
+      <w:proofErr w:type="gramEnd"/>
+      <w:r>
+        <w:rPr>
+          <w:lang w:val="en-GB"/>
+        </w:rPr>
+        <w:t xml:space="preserve"> but you gave me </w:t>
+      </w:r>
+      <w:proofErr w:type="spellStart"/>
+      <w:r>
+        <w:rPr>
+          <w:lang w:val="en-GB"/>
+        </w:rPr>
+        <w:t>javascript</w:t>
+      </w:r>
+      <w:proofErr w:type="spellEnd"/>
+      <w:r>
+        <w:rPr>
+          <w:lang w:val="en-GB"/>
+        </w:rPr>
+        <w:t xml:space="preserve"> </w:t>
+      </w:r>
+      <w:proofErr w:type="spellStart"/>
+      <w:r>
+        <w:rPr>
+          <w:lang w:val="en-GB"/>
+        </w:rPr>
+        <w:t>aswell</w:t>
+      </w:r>
+      <w:proofErr w:type="spellEnd"/>
+      <w:r>
+        <w:rPr>
+          <w:lang w:val="en-GB"/>
+        </w:rPr>
+        <w:t>.</w:t>
+      </w:r>
+    </w:p>
+    <w:p>
+      <w:pPr>
+        <w:rPr>
+          <w:lang w:val="en-GB"/>
+        </w:rPr>
+      </w:pPr>
+      <w:r>
+        <w:rPr>
+          <w:b/>
+          <w:bCs/>
+          <w:lang w:val="en-GB"/>
+        </w:rPr>
+        <w:t>4.</w:t>
+      </w:r>
+      <w:r>
+        <w:rPr>
+          <w:b/>
+          <w:bCs/>
+          <w:lang w:val="en-GB"/>
+        </w:rPr>
+        <w:t xml:space="preserve"> </w:t>
+      </w:r>
+      <w:r>
+        <w:rPr>
+          <w:lang w:val="en-GB"/>
+        </w:rPr>
+        <w:t xml:space="preserve">this is the house style </w:t>
+      </w:r>
+      <w:proofErr w:type="spellStart"/>
+      <w:r>
+        <w:rPr>
+          <w:lang w:val="en-GB"/>
+        </w:rPr>
+        <w:t>im</w:t>
+      </w:r>
+      <w:proofErr w:type="spellEnd"/>
+      <w:r>
+        <w:rPr>
+          <w:lang w:val="en-GB"/>
+        </w:rPr>
+        <w:t xml:space="preserve"> using change everything to that and make sure the home page everything is </w:t>
+      </w:r>
+      <w:proofErr w:type="spellStart"/>
+      <w:r>
+        <w:rPr>
+          <w:lang w:val="en-GB"/>
+        </w:rPr>
+        <w:t>centered</w:t>
+      </w:r>
+      <w:proofErr w:type="spellEnd"/>
+      <w:r>
+        <w:rPr>
+          <w:lang w:val="en-GB"/>
+        </w:rPr>
+        <w:t xml:space="preserve"> and evenly sized for the 3 icons</w:t>
+      </w:r>
+      <w:r>
+        <w:rPr>
+          <w:lang w:val="en-GB"/>
+        </w:rPr>
+        <w:t>.</w:t>
+      </w:r>
+    </w:p>
+    <w:p>
+      <w:pPr>
+        <w:rPr>
+          <w:lang w:val="en-GB"/>
+        </w:rPr>
+      </w:pPr>
+      <w:r>
+        <w:rPr>
+          <w:b/>
+          <w:bCs/>
+          <w:lang w:val="en-GB"/>
+        </w:rPr>
+        <w:t>5.</w:t>
+      </w:r>
+      <w:r>
+        <w:rPr>
+          <w:b/>
+          <w:bCs/>
+          <w:lang w:val="en-GB"/>
+        </w:rPr>
+        <w:t xml:space="preserve"> </w:t>
+      </w:r>
+      <w:r>
+        <w:rPr>
+          <w:lang w:val="en-GB"/>
+        </w:rPr>
+        <w:t>I want the navigator bar bigger also the icons on the landing page bigger</w:t>
+      </w:r>
+      <w:r>
+        <w:rPr>
+          <w:lang w:val="en-GB"/>
+        </w:rPr>
+        <w:t>.</w:t>
+      </w:r>
+    </w:p>
+    <w:p>
+      <w:pPr>
+        <w:spacing w:after="0"/>
+        <w:rPr>
+          <w:lang w:val="en-GB"/>
+        </w:rPr>
+      </w:pPr>
+      <w:r>
+        <w:rPr>
+          <w:b/>
+          <w:bCs/>
+          <w:lang w:val="en-GB"/>
+        </w:rPr>
+        <w:t>6</w:t>
+      </w:r>
+      <w:r>
+        <w:rPr>
+          <w:lang w:val="en-GB"/>
+        </w:rPr>
+        <w:t xml:space="preserve">. </w:t>
+      </w:r>
+      <w:r>
+        <w:rPr>
+          <w:lang w:val="en-GB"/>
+        </w:rPr>
+        <w:t xml:space="preserve">I want different pages these are all the pages there should be </w:t>
+      </w:r>
+    </w:p>
+    <w:p>
+      <w:pPr>
+        <w:spacing w:after="0"/>
+        <w:rPr>
+          <w:lang w:val="en-GB"/>
+        </w:rPr>
+      </w:pPr>
+      <w:r>
+        <w:rPr>
+          <w:lang w:val="en-GB"/>
+        </w:rPr>
+        <w:t>Need to have a forum where the admin can add or remove different items to the website.</w:t>
+      </w:r>
+    </w:p>
+    <w:p>
+      <w:pPr>
+        <w:spacing w:after="0"/>
+        <w:rPr>
+          <w:lang w:val="en-GB"/>
+        </w:rPr>
+      </w:pPr>
+      <w:r>
+        <w:rPr>
+          <w:lang w:val="en-GB"/>
+        </w:rPr>
+        <w:t>This forum needs to have a different page where the selected item can be changed.</w:t>
+      </w:r>
+    </w:p>
+    <w:p>
+      <w:pPr>
+        <w:spacing w:after="0"/>
+        <w:rPr>
+          <w:lang w:val="en-GB"/>
+        </w:rPr>
+      </w:pPr>
+      <w:r>
+        <w:rPr>
+          <w:lang w:val="en-GB"/>
+        </w:rPr>
+        <w:t xml:space="preserve">As a customer </w:t>
+      </w:r>
+      <w:proofErr w:type="spellStart"/>
+      <w:r>
+        <w:rPr>
+          <w:lang w:val="en-GB"/>
+        </w:rPr>
+        <w:t>i</w:t>
+      </w:r>
+      <w:proofErr w:type="spellEnd"/>
+      <w:r>
+        <w:rPr>
+          <w:lang w:val="en-GB"/>
+        </w:rPr>
+        <w:t xml:space="preserve"> want to be able to search for a specific product.</w:t>
+      </w:r>
+    </w:p>
+    <w:p>
+      <w:pPr>
+        <w:spacing w:after="0"/>
+        <w:rPr>
+          <w:lang w:val="en-GB"/>
+        </w:rPr>
+      </w:pPr>
+      <w:r>
+        <w:rPr>
+          <w:lang w:val="en-GB"/>
+        </w:rPr>
+        <w:t xml:space="preserve">As a customer </w:t>
+      </w:r>
+      <w:proofErr w:type="spellStart"/>
+      <w:r>
+        <w:rPr>
+          <w:lang w:val="en-GB"/>
+        </w:rPr>
+        <w:t>i</w:t>
+      </w:r>
+      <w:proofErr w:type="spellEnd"/>
+      <w:r>
+        <w:rPr>
+          <w:lang w:val="en-GB"/>
+        </w:rPr>
+        <w:t xml:space="preserve"> want to contact the company.</w:t>
+      </w:r>
+    </w:p>
+    <w:p>
+      <w:pPr>
+        <w:spacing w:after="0"/>
+        <w:rPr>
+          <w:lang w:val="en-GB"/>
+        </w:rPr>
+      </w:pPr>
+      <w:r>
+        <w:rPr>
+          <w:lang w:val="en-GB"/>
+        </w:rPr>
+        <w:t xml:space="preserve">As an admin </w:t>
+      </w:r>
+      <w:proofErr w:type="spellStart"/>
+      <w:r>
+        <w:rPr>
+          <w:lang w:val="en-GB"/>
+        </w:rPr>
+        <w:t>i</w:t>
+      </w:r>
+      <w:proofErr w:type="spellEnd"/>
+      <w:r>
+        <w:rPr>
+          <w:lang w:val="en-GB"/>
+        </w:rPr>
+        <w:t xml:space="preserve"> want to see the send messages.</w:t>
+      </w:r>
+    </w:p>
+    <w:p>
+      <w:pPr>
+        <w:spacing w:after="0"/>
+        <w:rPr>
+          <w:lang w:val="en-GB"/>
+        </w:rPr>
+      </w:pPr>
+      <w:r>
+        <w:rPr>
+          <w:lang w:val="en-GB"/>
+        </w:rPr>
+        <w:t xml:space="preserve">As a customer </w:t>
+      </w:r>
+      <w:proofErr w:type="spellStart"/>
+      <w:r>
+        <w:rPr>
+          <w:lang w:val="en-GB"/>
+        </w:rPr>
+        <w:t>i</w:t>
+      </w:r>
+      <w:proofErr w:type="spellEnd"/>
+      <w:r>
+        <w:rPr>
+          <w:lang w:val="en-GB"/>
+        </w:rPr>
+        <w:t xml:space="preserve"> want to make a reservation for a set </w:t>
+      </w:r>
+      <w:proofErr w:type="gramStart"/>
+      <w:r>
+        <w:rPr>
+          <w:lang w:val="en-GB"/>
+        </w:rPr>
+        <w:t>period of time</w:t>
+      </w:r>
+      <w:proofErr w:type="gramEnd"/>
+      <w:r>
+        <w:rPr>
+          <w:lang w:val="en-GB"/>
+        </w:rPr>
+        <w:t xml:space="preserve"> which would be 1h.</w:t>
+      </w:r>
+    </w:p>
+    <w:p>
+      <w:pPr>
+        <w:spacing w:after="0"/>
+        <w:rPr>
+          <w:lang w:val="en-GB"/>
+        </w:rPr>
+      </w:pPr>
+      <w:r>
+        <w:rPr>
+          <w:lang w:val="en-GB"/>
+        </w:rPr>
+        <w:t xml:space="preserve">As an admin </w:t>
+      </w:r>
+      <w:proofErr w:type="spellStart"/>
+      <w:r>
+        <w:rPr>
+          <w:lang w:val="en-GB"/>
+        </w:rPr>
+        <w:t>i</w:t>
+      </w:r>
+      <w:proofErr w:type="spellEnd"/>
+      <w:r>
+        <w:rPr>
+          <w:lang w:val="en-GB"/>
+        </w:rPr>
+        <w:t xml:space="preserve"> want to be able to view the reservations with detailed information about it and the customer.</w:t>
+      </w:r>
+    </w:p>
+    <w:p>
+      <w:pPr>
+        <w:spacing w:after="0"/>
+        <w:rPr>
+          <w:lang w:val="en-GB"/>
+        </w:rPr>
+      </w:pPr>
+      <w:r>
+        <w:rPr>
+          <w:lang w:val="en-GB"/>
+        </w:rPr>
+        <w:t xml:space="preserve">I want all these features implemented for different pages so </w:t>
+      </w:r>
+      <w:proofErr w:type="spellStart"/>
+      <w:r>
+        <w:rPr>
+          <w:lang w:val="en-GB"/>
+        </w:rPr>
+        <w:t>i</w:t>
+      </w:r>
+      <w:proofErr w:type="spellEnd"/>
+      <w:r>
+        <w:rPr>
+          <w:lang w:val="en-GB"/>
+        </w:rPr>
+        <w:t xml:space="preserve"> can easily change it once </w:t>
+      </w:r>
+      <w:proofErr w:type="spellStart"/>
+      <w:r>
+        <w:rPr>
+          <w:lang w:val="en-GB"/>
+        </w:rPr>
+        <w:t>i</w:t>
+      </w:r>
+      <w:proofErr w:type="spellEnd"/>
+      <w:r>
+        <w:rPr>
+          <w:lang w:val="en-GB"/>
+        </w:rPr>
+        <w:t xml:space="preserve"> will add </w:t>
+      </w:r>
+      <w:r>
+        <w:rPr>
+          <w:lang w:val="en-GB"/>
+        </w:rPr>
+        <w:t>PHP.</w:t>
+      </w:r>
+    </w:p>
+    <w:p>
+      <w:pPr>
+        <w:spacing w:after="0"/>
+        <w:rPr>
+          <w:lang w:val="en-GB"/>
+        </w:rPr>
+      </w:pPr>
+      <w:r>
+        <w:rPr>
+          <w:b/>
+          <w:bCs/>
+          <w:lang w:val="en-GB"/>
+        </w:rPr>
+        <w:t xml:space="preserve">7. </w:t>
+      </w:r>
+      <w:r>
+        <w:rPr>
+          <w:lang w:val="en-GB"/>
+        </w:rPr>
+        <w:t xml:space="preserve">update all the html files to </w:t>
+      </w:r>
+    </w:p>
+    <w:p>
+      <w:pPr>
+        <w:spacing w:after="0"/>
+        <w:rPr>
+          <w:lang w:val="en-GB"/>
+        </w:rPr>
+      </w:pPr>
+    </w:p>
+    <w:p>
+      <w:pPr>
+        <w:spacing w:after="0"/>
+        <w:rPr>
+          <w:lang w:val="en-GB"/>
+        </w:rPr>
+      </w:pPr>
+      <w:r>
+        <w:rPr>
+          <w:lang w:val="en-GB"/>
+        </w:rPr>
+        <w:t>```</w:t>
+      </w:r>
+    </w:p>
+    <w:p>
+      <w:pPr>
+        <w:spacing w:after="0"/>
+        <w:rPr>
+          <w:lang w:val="en-GB"/>
+        </w:rPr>
+      </w:pPr>
+      <w:r>
+        <w:rPr>
+          <w:lang w:val="en-GB"/>
+        </w:rPr>
+        <w:t xml:space="preserve">&lt;link </w:t>
+      </w:r>
+      <w:proofErr w:type="spellStart"/>
+      <w:r>
+        <w:rPr>
+          <w:lang w:val="en-GB"/>
+        </w:rPr>
+        <w:t>rel</w:t>
+      </w:r>
+      <w:proofErr w:type="spellEnd"/>
+      <w:r>
+        <w:rPr>
+          <w:lang w:val="en-GB"/>
+        </w:rPr>
+        <w:t xml:space="preserve">="stylesheet" </w:t>
+      </w:r>
+      <w:proofErr w:type="spellStart"/>
+      <w:r>
+        <w:rPr>
+          <w:lang w:val="en-GB"/>
+        </w:rPr>
+        <w:t>href</w:t>
+      </w:r>
+      <w:proofErr w:type="spellEnd"/>
+      <w:r>
+        <w:rPr>
+          <w:lang w:val="en-GB"/>
+        </w:rPr>
+        <w:t>="</w:t>
+      </w:r>
+      <w:proofErr w:type="spellStart"/>
+      <w:r>
+        <w:rPr>
+          <w:lang w:val="en-GB"/>
+        </w:rPr>
+        <w:t>css</w:t>
+      </w:r>
+      <w:proofErr w:type="spellEnd"/>
+      <w:r>
+        <w:rPr>
+          <w:lang w:val="en-GB"/>
+        </w:rPr>
+        <w:t>/style.css"&gt;</w:t>
+      </w:r>
+    </w:p>
+    <w:p>
+      <w:pPr>
+        <w:spacing w:after="0"/>
+        <w:rPr>
+          <w:lang w:val="en-GB"/>
+        </w:rPr>
+      </w:pPr>
+      <w:r>
+        <w:rPr>
+          <w:lang w:val="en-GB"/>
+        </w:rPr>
+        <w:t>``</w:t>
+      </w:r>
+      <w:r>
+        <w:rPr>
+          <w:lang w:val="en-GB"/>
+        </w:rPr>
+        <w:t>`</w:t>
+      </w:r>
+    </w:p>
+    <w:p>
+      <w:pPr>
+        <w:spacing w:after="0"/>
+        <w:rPr>
+          <w:lang w:val="en-GB"/>
+        </w:rPr>
+      </w:pPr>
+      <w:r>
+        <w:rPr>
+          <w:b/>
+          <w:bCs/>
+          <w:lang w:val="en-GB"/>
+        </w:rPr>
+        <w:t xml:space="preserve">8. </w:t>
+      </w:r>
+      <w:r>
+        <w:rPr>
+          <w:lang w:val="en-GB"/>
+        </w:rPr>
+        <w:t xml:space="preserve">I want the buttons on the nav bar to also show up when you click on the login page. Because </w:t>
+      </w:r>
+      <w:proofErr w:type="gramStart"/>
+      <w:r>
+        <w:rPr>
+          <w:lang w:val="en-GB"/>
+        </w:rPr>
+        <w:t>at the moment</w:t>
+      </w:r>
+      <w:proofErr w:type="gramEnd"/>
+      <w:r>
+        <w:rPr>
+          <w:lang w:val="en-GB"/>
+        </w:rPr>
+        <w:t xml:space="preserve"> it only says home and back. </w:t>
+      </w:r>
+      <w:proofErr w:type="spellStart"/>
+      <w:r>
+        <w:rPr>
+          <w:lang w:val="en-GB"/>
+        </w:rPr>
+        <w:t>i</w:t>
+      </w:r>
+      <w:proofErr w:type="spellEnd"/>
+      <w:r>
+        <w:rPr>
+          <w:lang w:val="en-GB"/>
+        </w:rPr>
+        <w:t xml:space="preserve"> like the back feature </w:t>
+      </w:r>
+      <w:proofErr w:type="spellStart"/>
+      <w:r>
+        <w:rPr>
+          <w:lang w:val="en-GB"/>
+        </w:rPr>
+        <w:t>tho</w:t>
+      </w:r>
+      <w:proofErr w:type="spellEnd"/>
+      <w:r>
+        <w:rPr>
+          <w:lang w:val="en-GB"/>
+        </w:rPr>
+        <w:t xml:space="preserve"> keep that</w:t>
+      </w:r>
+      <w:r>
+        <w:rPr>
+          <w:lang w:val="en-GB"/>
+        </w:rPr>
+        <w:t>.</w:t>
       </w:r>
     </w:p>
     <w:sectPr>
@@ -2364,7 +3381,6 @@
   <w:style w:type="character" w:default="1" w:styleId="Standaardalinea-lettertype">
     <w:name w:val="Default Paragraph Font"/>
     <w:uiPriority w:val="1"/>
-    <w:semiHidden/>
     <w:unhideWhenUsed/>
   </w:style>
   <w:style w:type="table" w:default="1" w:styleId="Standaardtabel">

</xml_diff>